<commit_message>
feat(minigame): hoan thien minigame noi phuong trinh, 3 bang xep hang rieng biet + Top XP, logo moi va cap nhat he thong
</commit_message>
<xml_diff>
--- a/TAI_LIEU_CONG_NGHE_SIMLAB.docx
+++ b/TAI_LIEU_CONG_NGHE_SIMLAB.docx
@@ -4244,6 +4244,20 @@
       </w:r>
     </w:p>
     <w:p>
+      <w:r>
+        <w:t>8.3.4. Phát triển Hệ sinh thái Trò chơi hóa (Gamification) và Khám phá độc lập</w:t>
+        <w:br/>
+        <w:t>Chế độ không gian mở (Sandbox) sẽ được mở rộng giới hạn biên của các tham số vật lý và hóa học để người học tự do thử nghiệm. Đặc biệt, để giải quyết bài toán cạn kiệt nội dung và tăng tỷ lệ giữ chân người dùng (Retention Rate), hệ thống sẽ tích hợp sâu cơ chế Trò chơi hóa (Gamification). Dự án sẽ phát triển các Minigame thực hành có tính giờ (như 'Nối phương trình hóa học', 'Pha chế siêu tốc', 'Trinh thám mất nhãn'). Đi kèm với đó là hệ thống Bảng xếp hạng (Leaderboard) thi đua theo cấp lớp, cấp trường và toàn quốc. Tính năng này giúp kích thích bản năng cạnh tranh của học sinh, biến việc ghi nhớ công thức hóa học khô khan thành một trải nghiệm đua Top đầy hứng thú.</w:t>
+      </w:r>
+    </w:p>
+    <w:p>
+      <w:r>
+        <w:t>8.3.6. Phát triển Ứng dụng di động gốc (Native Mobile App)</w:t>
+        <w:br/>
+        <w:t>Mặc dù kiến trúc hiện tại (Web/PWA) đã tối ưu tốt cho trình duyệt, định hướng chiến lược trong tương lai của SimLab Edu là đóng gói và phát triển Ứng dụng di động gốc (Native App) trên cả hai nền tảng iOS và Android (dự kiến sử dụng React Native hoặc Flutter). Việc phát hành ứng dụng chuyên biệt không chỉ giúp gia tăng độ nhận diện thương hiệu trên App Store và Google Play mà còn cho phép tận dụng tối đa tài nguyên phần cứng (GPU) của thiết bị di động để kết xuất các mô hình giải phẫu 3D mượt mà hơn. Ứng dụng cũng sẽ tích hợp tính năng thông báo đẩy (Push Notifications) để nhắc nhở lịch làm bài tập, giúp học sinh dễ dàng luyện tập và tham gia Minigame mọi lúc mọi nơi chỉ với một cú chạm.</w:t>
+      </w:r>
+    </w:p>
+    <w:p>
       <w:pPr>
         <w:pStyle w:val="ListBullet"/>
         <w:spacing w:after="60" w:line="276" w:lineRule="auto"/>

</xml_diff>